<commit_message>
feat: Bao cao chi tiet ro rang cac thu muc trong file khong nop cua tung giao vien tren Google Drive
</commit_message>
<xml_diff>
--- a/data/corrected/BAO_CAO_GIAM_SAT_TIEN_DO_GIAO_AN_GOOGLE_DRIVE.docx
+++ b/data/corrected/BAO_CAO_GIAM_SAT_TIEN_DO_GIAO_AN_GOOGLE_DRIVE.docx
@@ -197,7 +197,7 @@
         <w:t xml:space="preserve">- Thời điểm tổng hợp dữ liệu: </w:t>
       </w:r>
       <w:r>
-        <w:t>08/10/2026 13:07 • Đối tượng: Toàn bộ 08 giáo viên trong tổ.</w:t>
+        <w:t>08/10/2026 13:32 • Đối tượng: Toàn bộ 08 giáo viên trong tổ.</w:t>
       </w:r>
     </w:p>
     <w:tbl>
@@ -417,7 +417,7 @@
               <w:rPr>
                 <w:sz w:val="20"/>
               </w:rPr>
-              <w:t>Đã nộp Tuần 1-4 &amp; Tuần 5-8</w:t>
+              <w:t>Đã nộp Tuần 1-4 &amp; 5-8 (Trống 7 thư mục tuần)</w:t>
             </w:r>
           </w:p>
         </w:tc>
@@ -433,7 +433,7 @@
               <w:rPr>
                 <w:sz w:val="19"/>
               </w:rPr>
-              <w:t>Đã nộp 17 tệp (Tuần 1-4: 9 tệp, Tuần 5-8: 8 tệp). Tuần 9 đến 35: Chưa nộp</w:t>
+              <w:t>✔ Đã nộp (17 tệp): Tuần 1-4: 9 tệp, Tuần 5-8: 8 tệp. ❌ Thư mục trống file (Không nộp): 7 thư mục gồm Tuần 9-12, Tuần 13-16, Tuần 17-20, Tuần 21-24, Tuần 25-28, Tuần 29-32, Tuần 33-35.</w:t>
             </w:r>
           </w:p>
         </w:tc>
@@ -516,7 +516,7 @@
               <w:rPr>
                 <w:sz w:val="20"/>
               </w:rPr>
-              <w:t>Đã nộp Tuần 1-4 &amp; Tuần 5-8</w:t>
+              <w:t>Đã nộp Tuần 1-4 &amp; 5-8 (Trống 7 thư mục tuần)</w:t>
             </w:r>
           </w:p>
         </w:tc>
@@ -532,7 +532,7 @@
               <w:rPr>
                 <w:sz w:val="19"/>
               </w:rPr>
-              <w:t>Đã nộp 35 tệp (Tuần 1-4: 15 tệp, Tuần 5-8: 20 tệp). Tuần 9 đến 35: Chưa nộp</w:t>
+              <w:t>✔ Đã nộp (35 tệp): Tuần 1-4: 15 tệp, Tuần 5-8: 20 tệp. ❌ Thư mục trống file (Không nộp): 7 thư mục gồm Tuần 9-12, Tuần 13-16, Tuần 17-20, Tuần 21-24, Tuần 25-28, Tuần 29-32, Tuần 33-35.</w:t>
             </w:r>
           </w:p>
         </w:tc>
@@ -615,7 +615,7 @@
               <w:rPr>
                 <w:sz w:val="20"/>
               </w:rPr>
-              <w:t>Đã nộp Tuần 1-4 &amp; Tuần 5-8</w:t>
+              <w:t>Đã nộp Tuần 1-12 (Trống 6 thư mục tuần)</w:t>
             </w:r>
           </w:p>
         </w:tc>
@@ -631,7 +631,7 @@
               <w:rPr>
                 <w:sz w:val="19"/>
               </w:rPr>
-              <w:t>Đã nộp 27 tệp (Tuần 1-4: 13 tệp, Tuần 5-8: 13 tệp). Tuần 9 đến 35: Chưa nộp</w:t>
+              <w:t>✔ Đã nộp (27 tệp): Tuần 1-4: 13 tệp, Tuần 5-8: 13 tệp, Tuần 9-12: 1 tệp. ❌ Thư mục trống file (Không nộp): 6 thư mục gồm Tuần 13-16, Tuần 17-20, Tuần 21-24, Tuần 25-28, Tuần 29-32, Tuần 33-35.</w:t>
             </w:r>
           </w:p>
         </w:tc>
@@ -714,7 +714,7 @@
               <w:rPr>
                 <w:sz w:val="20"/>
               </w:rPr>
-              <w:t>Đã nộp Tuần 1-4 &amp; Tuần 5-8</w:t>
+              <w:t>Đã nộp Tuần 1-4 &amp; 5-8 (Trống 7 thư mục tuần)</w:t>
             </w:r>
           </w:p>
         </w:tc>
@@ -730,7 +730,7 @@
               <w:rPr>
                 <w:sz w:val="19"/>
               </w:rPr>
-              <w:t>Đã nộp 14 tệp (Tuần 1-4: 7 tệp, Tuần 5-8: 7 tệp). Tuần 9 đến 35: Chưa nộp</w:t>
+              <w:t>✔ Đã nộp (14 tệp): Tuần 1-4: 7 tệp, Tuần 5-8: 7 tệp. ❌ Thư mục trống file (Không nộp): 7 thư mục gồm Tuần 9-12, Tuần 13-16, Tuần 17-20, Tuần 21-24, Tuần 25-28, Tuần 29-32, Tuần 33-35. Lưu ý: Thư mục môn Toán 8 trống file (0 tệp).</w:t>
             </w:r>
           </w:p>
         </w:tc>
@@ -813,7 +813,7 @@
               <w:rPr>
                 <w:sz w:val="20"/>
               </w:rPr>
-              <w:t>Đã nộp Tuần 1-4 &amp; Tuần 5-8</w:t>
+              <w:t>Đã nộp Tuần 1-4 &amp; 5-8 (Trống 7 thư mục tuần)</w:t>
             </w:r>
           </w:p>
         </w:tc>
@@ -829,7 +829,7 @@
               <w:rPr>
                 <w:sz w:val="19"/>
               </w:rPr>
-              <w:t>Đã nộp 40 tệp (Tuần 1-4: 19 tệp, Tuần 5-8: 20 tệp). Tuần 9 đến 35: Chưa nộp</w:t>
+              <w:t>✔ Đã nộp (40 tệp): Tuần 1-4: 19 tệp, Tuần 5-8: 20 tệp. ❌ Thư mục trống file (Không nộp): 7 thư mục gồm Tuần 9-12, Tuần 13-16, Tuần 17-20, Tuần 21-24, Tuần 25-28, Tuần 29-32, Tuần 33-35. Lưu ý: Thư mục môn Toán 6 trống file (0 tệp).</w:t>
             </w:r>
           </w:p>
         </w:tc>
@@ -912,7 +912,7 @@
               <w:rPr>
                 <w:sz w:val="20"/>
               </w:rPr>
-              <w:t>Đã nộp Tuần 1-4 &amp; Tuần 5-8</w:t>
+              <w:t>Đã nộp Tuần 1-4 &amp; 5-8 (Trống 7 thư mục tuần)</w:t>
             </w:r>
           </w:p>
         </w:tc>
@@ -928,7 +928,7 @@
               <w:rPr>
                 <w:sz w:val="19"/>
               </w:rPr>
-              <w:t>Đã nộp 9 tệp (Tuần 1-4: 4 tệp, Tuần 5-8: 5 tệp). Tuần 9 đến 35: Chưa nộp</w:t>
+              <w:t>✔ Đã nộp (9 tệp): Tuần 1-4: 4 tệp, Tuần 5-8: 5 tệp. ❌ Thư mục trống file (Không nộp): 7 thư mục gồm Tuần 9-12, Tuần 13-16, Tuần 17-20, Tuần 21-24, Tuần 25-28, Tuần 29-32, Tuần 33-35.</w:t>
             </w:r>
           </w:p>
         </w:tc>
@@ -1011,7 +1011,7 @@
               <w:rPr>
                 <w:sz w:val="20"/>
               </w:rPr>
-              <w:t>Đã nộp Tuần 1-4 &amp; Tuần 5-8</w:t>
+              <w:t>Đã nộp Tuần 1-4 &amp; 5-8 (Trống 7 thư mục tuần)</w:t>
             </w:r>
           </w:p>
         </w:tc>
@@ -1027,7 +1027,7 @@
               <w:rPr>
                 <w:sz w:val="19"/>
               </w:rPr>
-              <w:t>Đã nộp 30 tệp (Tuần 1-4: 17 tệp, Tuần 5-8: 13 tệp). Tuần 9 đến 35: Chưa nộp</w:t>
+              <w:t>✔ Đã nộp (30 tệp): Tuần 1-4: 17 tệp, Tuần 5-8: 13 tệp. ❌ Thư mục trống file (Không nộp): 7 thư mục gồm Tuần 9-12, Tuần 13-16, Tuần 17-20, Tuần 21-24, Tuần 25-28, Tuần 29-32, Tuần 33-35.</w:t>
             </w:r>
           </w:p>
         </w:tc>
@@ -1110,7 +1110,7 @@
               <w:rPr>
                 <w:sz w:val="20"/>
               </w:rPr>
-              <w:t>CHƯA NỘP (Thư mục trống)</w:t>
+              <w:t>CHƯA NỘP (Trống 9/9 thư mục tuần)</w:t>
             </w:r>
           </w:p>
         </w:tc>
@@ -1126,7 +1126,7 @@
               <w:rPr>
                 <w:sz w:val="19"/>
               </w:rPr>
-              <w:t>Thư mục trên Google Drive chưa có tệp giáo án nào (0/9 chu kỳ tuần)</w:t>
+              <w:t>❌ Thư mục trống file (Không nộp): Trống toàn bộ 9/9 thư mục tuần (Tuần 1-4, Tuần 5-8, Tuần 9-12, Tuần 13-16, Tuần 17-20, Tuần 21-24, Tuần 25-28, Tuần 29-32, Tuần 33-35). Cả 3 môn phụ trách (Hóa 9, KHTN 7, Toán 9) đều chưa có tệp tin nào.</w:t>
             </w:r>
           </w:p>
         </w:tc>
@@ -1152,7 +1152,7 @@
         <w:rPr>
           <w:sz w:val="23"/>
         </w:rPr>
-        <w:t>1. Về tiến độ Tuần 1 đến Tuần 4: Đã có 7/08 giáo viên nộp KHDY với tổng cộng 84 tệp tin (Phạm Thị Cúc: 9 tệp, Lê Thị Thúy Hằng: 15 tệp, Hà Thị Kế: 13 tệp, Phạm Thị Mỹ Linh: 7 tệp, Lê Thị Thu Thủy: 19 tệp, Nguyễn Thị Thùy Trang: 4 tệp, Nguyễn Chí Thành: 17 tệp). Có 1 giáo viên (Lê Văn Thắng) chưa cập nhật tệp tin nào lên thư mục Google Drive.</w:t>
+        <w:t>1. Về tiến độ Tuần 1 đến Tuần 4: Đã có 7/08 giáo viên nộp KHDY với tổng cộng 84 tệp tin (Phạm Thị Cúc: 9 tệp, Lê Thị Thúy Hằng: 15 tệp, Hà Thị Kế: 13 tệp, Phạm Thị Mỹ Linh: 7 tệp, Lê Thị Thu Thủy: 19 tệp, Nguyễn Thị Thùy Trang: 4 tệp, Nguyễn Chí Thành: 17 tệp). Riêng thầy Lê Văn Thắng chưa cập nhật tệp tin nào lên thư mục Google Drive (0 tệp).</w:t>
       </w:r>
     </w:p>
     <w:p>
@@ -1176,7 +1176,7 @@
         <w:rPr>
           <w:sz w:val="23"/>
         </w:rPr>
-        <w:t>3. Về tiến độ Tuần 9 đến Tuần 35: Hiện tại tất cả 08 giáo viên chưa tải lên (0 tệp) do chưa đến chu kỳ kiểm tra tiếp theo.</w:t>
+        <w:t>3. Về các thư mục tuần còn trống file (Không nộp file):</w:t>
       </w:r>
     </w:p>
     <w:p>
@@ -1188,7 +1188,55 @@
         <w:rPr>
           <w:sz w:val="23"/>
         </w:rPr>
-        <w:t>4. Kiến nghị: Kính đề nghị Tổ trưởng chuyên môn nhắc nhở 1 giáo viên (Lê Văn Thắng) khẩn trương cập nhật giáo án lên Google Drive phục vụ công tác kiểm tra, duyệt giáo án định kỳ.</w:t>
+        <w:t xml:space="preserve">   - Thầy Lê Văn Thắng: Trống toàn bộ 09/09 thư mục tuần (Tuần 1-4, Tuần 5-8, Tuần 9-12, Tuần 13-16, Tuần 17-20, Tuần 21-24, Tuần 25-28, Tuần 29-32, Tuần 33-35). Cả 3 môn phụ trách (Hóa 9, KHTN 7, Toán 9) đều chưa có tệp tin nào trên Drive.</w:t>
+      </w:r>
+    </w:p>
+    <w:p>
+      <w:pPr>
+        <w:spacing w:after="40"/>
+        <w:ind w:left="288"/>
+      </w:pPr>
+      <w:r>
+        <w:rPr>
+          <w:sz w:val="23"/>
+        </w:rPr>
+        <w:t xml:space="preserve">   - Cô Hà Thị Kế: Đã nộp Tuần 1-12 (27 tệp); Còn trống 06 thư mục tuần gồm: Tuần 13-16, Tuần 17-20, Tuần 21-24, Tuần 25-28, Tuần 29-32, Tuần 33-35.</w:t>
+      </w:r>
+    </w:p>
+    <w:p>
+      <w:pPr>
+        <w:spacing w:after="40"/>
+        <w:ind w:left="288"/>
+      </w:pPr>
+      <w:r>
+        <w:rPr>
+          <w:sz w:val="23"/>
+        </w:rPr>
+        <w:t xml:space="preserve">   - 06 Giáo viên còn lại (Cô Cúc, Cô Hằng, Cô Linh, Cô Thủy, Cô Trang, Thầy Thành): Đã nộp Tuần 1-4 &amp; Tuần 5-8; Còn trống 07 thư mục tuần gồm: Tuần 9-12, Tuần 13-16, Tuần 17-20, Tuần 21-24, Tuần 25-28, Tuần 29-32, Tuần 33-35.</w:t>
+      </w:r>
+    </w:p>
+    <w:p>
+      <w:pPr>
+        <w:spacing w:after="40"/>
+        <w:ind w:left="288"/>
+      </w:pPr>
+      <w:r>
+        <w:rPr>
+          <w:sz w:val="23"/>
+        </w:rPr>
+        <w:t xml:space="preserve">   - Rà soát môn học trống file: Thư mục môn Toán 6 của Cô Lê Thị Thu Thủy và môn Toán 8 của Cô Phạm Thị Mỹ Linh hiện tại còn trống tệp tin (0 tệp).</w:t>
+      </w:r>
+    </w:p>
+    <w:p>
+      <w:pPr>
+        <w:spacing w:after="40"/>
+        <w:ind w:left="288"/>
+      </w:pPr>
+      <w:r>
+        <w:rPr>
+          <w:sz w:val="23"/>
+        </w:rPr>
+        <w:t>4. Kiến nghị: Kính đề nghị Tổ trưởng chuyên môn nhắc nhở giáo viên chưa nộp (thầy Lê Văn Thắng) và các giáo viên còn thiếu thư mục tuần/môn phụ trách khẩn trương nộp bổ sung lên Google Drive phục vụ công tác kiểm tra, duyệt giáo án định kỳ.</w:t>
       </w:r>
     </w:p>
     <w:p>

</xml_diff>

<commit_message>
fix: Bao cao chi tiet thu muc mon hoc khong co nop file trong tung tuan theo dung yeu cau nguoi dung
</commit_message>
<xml_diff>
--- a/data/corrected/BAO_CAO_GIAM_SAT_TIEN_DO_GIAO_AN_GOOGLE_DRIVE.docx
+++ b/data/corrected/BAO_CAO_GIAM_SAT_TIEN_DO_GIAO_AN_GOOGLE_DRIVE.docx
@@ -197,7 +197,7 @@
         <w:t xml:space="preserve">- Thời điểm tổng hợp dữ liệu: </w:t>
       </w:r>
       <w:r>
-        <w:t>08/10/2026 13:32 • Đối tượng: Toàn bộ 08 giáo viên trong tổ.</w:t>
+        <w:t>08/10/2026 14:01 • Đối tượng: Toàn bộ 08 giáo viên trong tổ.</w:t>
       </w:r>
     </w:p>
     <w:tbl>
@@ -417,7 +417,7 @@
               <w:rPr>
                 <w:sz w:val="20"/>
               </w:rPr>
-              <w:t>Đã nộp Tuần 1-4 &amp; 5-8 (Trống 7 thư mục tuần)</w:t>
+              <w:t>Đã nộp đầy đủ Tuần 1-4 &amp; 5-8</w:t>
             </w:r>
           </w:p>
         </w:tc>
@@ -433,7 +433,7 @@
               <w:rPr>
                 <w:sz w:val="19"/>
               </w:rPr>
-              <w:t>✔ Đã nộp (17 tệp): Tuần 1-4: 9 tệp, Tuần 5-8: 8 tệp. ❌ Thư mục trống file (Không nộp): 7 thư mục gồm Tuần 9-12, Tuần 13-16, Tuần 17-20, Tuần 21-24, Tuần 25-28, Tuần 29-32, Tuần 33-35.</w:t>
+              <w:t>✔ Đã nộp (17 tệp): Tuần 1 đến 4: KHTN 7 (7 tệp), Sinh 9 (2 tệp); Tuần 5 đến 8: KHTN 7 (6 tệp), Sinh 9 (2 tệp). Đã nộp đầy đủ các thư mục môn phụ trách (không có thư mục môn nào trống file). (Tuần 9 đến 35: Chưa đến hạn nộp)</w:t>
             </w:r>
           </w:p>
         </w:tc>
@@ -516,7 +516,7 @@
               <w:rPr>
                 <w:sz w:val="20"/>
               </w:rPr>
-              <w:t>Đã nộp Tuần 1-4 &amp; 5-8 (Trống 7 thư mục tuần)</w:t>
+              <w:t>Đã nộp đầy đủ Tuần 1-4 &amp; 5-8</w:t>
             </w:r>
           </w:p>
         </w:tc>
@@ -532,7 +532,7 @@
               <w:rPr>
                 <w:sz w:val="19"/>
               </w:rPr>
-              <w:t>✔ Đã nộp (35 tệp): Tuần 1-4: 15 tệp, Tuần 5-8: 20 tệp. ❌ Thư mục trống file (Không nộp): 7 thư mục gồm Tuần 9-12, Tuần 13-16, Tuần 17-20, Tuần 21-24, Tuần 25-28, Tuần 29-32, Tuần 33-35.</w:t>
+              <w:t>✔ Đã nộp (35 tệp): Tuần 1 đến 4: CN 6 (2 tệp), CN 7 (3 tệp), HĐTN 6 (5 tệp), HĐTN 7 (4 tệp), HĐTN 9 (1 tệp); Tuần 5 đến 8: CN 6 (3 tệp), CN 7 (4 tệp), HĐTN 6 (4 tệp), HĐTN 7 (4 tệp), HĐTN 9 (5 tệp). Đã nộp đầy đủ các thư mục môn phụ trách (không có thư mục môn nào trống file). (Tuần 9 đến 35: Chưa đến hạn nộp)</w:t>
             </w:r>
           </w:p>
         </w:tc>
@@ -615,7 +615,7 @@
               <w:rPr>
                 <w:sz w:val="20"/>
               </w:rPr>
-              <w:t>Đã nộp Tuần 1-12 (Trống 6 thư mục tuần)</w:t>
+              <w:t>Đã nộp Tuần 1-12 (Tuần 9-12 thư mục HĐTN 8 &amp; KHTN 6 không có nộp file)</w:t>
             </w:r>
           </w:p>
         </w:tc>
@@ -631,7 +631,7 @@
               <w:rPr>
                 <w:sz w:val="19"/>
               </w:rPr>
-              <w:t>✔ Đã nộp (27 tệp): Tuần 1-4: 13 tệp, Tuần 5-8: 13 tệp, Tuần 9-12: 1 tệp. ❌ Thư mục trống file (Không nộp): 6 thư mục gồm Tuần 13-16, Tuần 17-20, Tuần 21-24, Tuần 25-28, Tuần 29-32, Tuần 33-35.</w:t>
+              <w:t>✔ Đã nộp (27 tệp): Tuần 1 đến 4: HĐTN 8 (4 tệp), KHTN 6 (8 tệp), KHTN 8 (1 tệp); Tuần 5 đến 8: HĐTN 8 (5 tệp), KHTN 6 (5 tệp), KHTN 8 (3 tệp); Tuần 9 đến 12: KHTN 8 (1 tệp). ❌ Thư mục không có nộp file: Tuần 9 đến 12 thư mục HĐTN 8 không có nộp file (0 tệp); Tuần 9 đến 12 thư mục KHTN 6 không có nộp file (0 tệp). (Tuần 13 đến 35: Chưa đến hạn nộp)</w:t>
             </w:r>
           </w:p>
         </w:tc>
@@ -714,7 +714,7 @@
               <w:rPr>
                 <w:sz w:val="20"/>
               </w:rPr>
-              <w:t>Đã nộp Tuần 1-4 &amp; 5-8 (Trống 7 thư mục tuần)</w:t>
+              <w:t>Đã nộp Tuần 1-4 &amp; 5-8 (Tuần 1-4 và 5-8 thư mục Toán 6 không có nộp file)</w:t>
             </w:r>
           </w:p>
         </w:tc>
@@ -730,7 +730,7 @@
               <w:rPr>
                 <w:sz w:val="19"/>
               </w:rPr>
-              <w:t>✔ Đã nộp (14 tệp): Tuần 1-4: 7 tệp, Tuần 5-8: 7 tệp. ❌ Thư mục trống file (Không nộp): 7 thư mục gồm Tuần 9-12, Tuần 13-16, Tuần 17-20, Tuần 21-24, Tuần 25-28, Tuần 29-32, Tuần 33-35. Lưu ý: Thư mục môn Toán 8 trống file (0 tệp).</w:t>
+              <w:t>✔ Đã nộp (14 tệp): Tuần 1 đến 4: Toán 9 (7 tệp); Tuần 5 đến 8: Toán 9 (7 tệp). ❌ Thư mục không có nộp file: Tuần 1 đến 4 thư mục Toán 6 không có nộp file (0 tệp); Tuần 5 đến 8 thư mục Toán 6 không có nộp file (0 tệp). (Tuần 9 đến 35: Chưa đến hạn nộp)</w:t>
             </w:r>
           </w:p>
         </w:tc>
@@ -813,7 +813,7 @@
               <w:rPr>
                 <w:sz w:val="20"/>
               </w:rPr>
-              <w:t>Đã nộp Tuần 1-4 &amp; 5-8 (Trống 7 thư mục tuần)</w:t>
+              <w:t>Đã nộp Tuần 1-4 &amp; 5-8 (Tuần 1-4 và 5-8 thư mục Toán 6 không có nộp file)</w:t>
             </w:r>
           </w:p>
         </w:tc>
@@ -829,7 +829,7 @@
               <w:rPr>
                 <w:sz w:val="19"/>
               </w:rPr>
-              <w:t>✔ Đã nộp (40 tệp): Tuần 1-4: 19 tệp, Tuần 5-8: 20 tệp. ❌ Thư mục trống file (Không nộp): 7 thư mục gồm Tuần 9-12, Tuần 13-16, Tuần 17-20, Tuần 21-24, Tuần 25-28, Tuần 29-32, Tuần 33-35. Lưu ý: Thư mục môn Toán 6 trống file (0 tệp).</w:t>
+              <w:t>✔ Đã nộp (40 tệp): Tuần 1 đến 4: Toán 7 (9 tệp), Toán 8 (10 tệp); Tuần 5 đến 8: Toán 7 (11 tệp), Toán 8 (9 tệp); Gốc: 1 tệp. ❌ Thư mục không có nộp file: Tuần 1 đến 4 thư mục Toán 6 không có nộp file (0 tệp); Tuần 5 đến 8 thư mục Toán 6 không có nộp file (0 tệp). (Tuần 9 đến 35: Chưa đến hạn nộp)</w:t>
             </w:r>
           </w:p>
         </w:tc>
@@ -912,7 +912,7 @@
               <w:rPr>
                 <w:sz w:val="20"/>
               </w:rPr>
-              <w:t>Đã nộp Tuần 1-4 &amp; 5-8 (Trống 7 thư mục tuần)</w:t>
+              <w:t>Đã nộp đầy đủ Tuần 1-4 &amp; 5-8</w:t>
             </w:r>
           </w:p>
         </w:tc>
@@ -928,7 +928,7 @@
               <w:rPr>
                 <w:sz w:val="19"/>
               </w:rPr>
-              <w:t>✔ Đã nộp (9 tệp): Tuần 1-4: 4 tệp, Tuần 5-8: 5 tệp. ❌ Thư mục trống file (Không nộp): 7 thư mục gồm Tuần 9-12, Tuần 13-16, Tuần 17-20, Tuần 21-24, Tuần 25-28, Tuần 29-32, Tuần 33-35.</w:t>
+              <w:t>✔ Đã nộp (9 tệp): Tuần 1 đến 4: CN 8 (2 tệp), CN 9 (2 tệp); Tuần 5 đến 8: CN 8 (3 tệp), CN 9 (2 tệp). Đã nộp đầy đủ các thư mục môn phụ trách (không có thư mục môn nào trống file). (Tuần 9 đến 35: Chưa đến hạn nộp)</w:t>
             </w:r>
           </w:p>
         </w:tc>
@@ -1011,7 +1011,7 @@
               <w:rPr>
                 <w:sz w:val="20"/>
               </w:rPr>
-              <w:t>Đã nộp Tuần 1-4 &amp; 5-8 (Trống 7 thư mục tuần)</w:t>
+              <w:t>Đã nộp đầy đủ Tuần 1-4 &amp; 5-8</w:t>
             </w:r>
           </w:p>
         </w:tc>
@@ -1027,7 +1027,7 @@
               <w:rPr>
                 <w:sz w:val="19"/>
               </w:rPr>
-              <w:t>✔ Đã nộp (30 tệp): Tuần 1-4: 17 tệp, Tuần 5-8: 13 tệp. ❌ Thư mục trống file (Không nộp): 7 thư mục gồm Tuần 9-12, Tuần 13-16, Tuần 17-20, Tuần 21-24, Tuần 25-28, Tuần 29-32, Tuần 33-35.</w:t>
+              <w:t>✔ Đã nộp (30 tệp): Tuần 1 đến 4: HĐTN 8 (2 tệp), KHTN 6 (9 tệp), KHTN 8 (5 tệp), KHTN 9 (1 tệp); Tuần 5 đến 8: HĐTN 8 (1 tệp), KHTN 6 (7 tệp), KHTN 8 (3 tệp), KHTN 9 (2 tệp). Đã nộp đầy đủ các thư mục môn phụ trách (không có thư mục môn nào trống file). (Tuần 9 đến 35: Chưa đến hạn nộp)</w:t>
             </w:r>
           </w:p>
         </w:tc>
@@ -1110,7 +1110,7 @@
               <w:rPr>
                 <w:sz w:val="20"/>
               </w:rPr>
-              <w:t>CHƯA NỘP (Trống 9/9 thư mục tuần)</w:t>
+              <w:t>CHƯA NỘP (Tuần 1-4 và 5-8 các thư mục môn đều không có nộp file)</w:t>
             </w:r>
           </w:p>
         </w:tc>
@@ -1126,7 +1126,7 @@
               <w:rPr>
                 <w:sz w:val="19"/>
               </w:rPr>
-              <w:t>❌ Thư mục trống file (Không nộp): Trống toàn bộ 9/9 thư mục tuần (Tuần 1-4, Tuần 5-8, Tuần 9-12, Tuần 13-16, Tuần 17-20, Tuần 21-24, Tuần 25-28, Tuần 29-32, Tuần 33-35). Cả 3 môn phụ trách (Hóa 9, KHTN 7, Toán 9) đều chưa có tệp tin nào.</w:t>
+              <w:t>❌ Thư mục không có nộp file: Tuần 1 đến 4 thư mục Hóa 9, KHTN 7, Toán 9 không có nộp file (0 tệp); Tuần 5 đến 8 thư mục Hóa 9, KHTN 7, Toán 9 không có nộp file (0 tệp). (Chưa có tệp giáo án nào trên Drive)</w:t>
             </w:r>
           </w:p>
         </w:tc>
@@ -1176,7 +1176,7 @@
         <w:rPr>
           <w:sz w:val="23"/>
         </w:rPr>
-        <w:t>3. Về các thư mục tuần còn trống file (Không nộp file):</w:t>
+        <w:t>3. Về tình hình các thư mục môn học không có nộp file (0 tệp):</w:t>
       </w:r>
     </w:p>
     <w:p>
@@ -1188,7 +1188,7 @@
         <w:rPr>
           <w:sz w:val="23"/>
         </w:rPr>
-        <w:t xml:space="preserve">   - Thầy Lê Văn Thắng: Trống toàn bộ 09/09 thư mục tuần (Tuần 1-4, Tuần 5-8, Tuần 9-12, Tuần 13-16, Tuần 17-20, Tuần 21-24, Tuần 25-28, Tuần 29-32, Tuần 33-35). Cả 3 môn phụ trách (Hóa 9, KHTN 7, Toán 9) đều chưa có tệp tin nào trên Drive.</w:t>
+        <w:t xml:space="preserve">   - Cô Phạm Thị Mỹ Linh: Tuần 1 đến 4 thư mục Toán 6 không có nộp file (0 tệp); Tuần 5 đến 8 thư mục Toán 6 không có nộp file (0 tệp).</w:t>
       </w:r>
     </w:p>
     <w:p>
@@ -1200,7 +1200,7 @@
         <w:rPr>
           <w:sz w:val="23"/>
         </w:rPr>
-        <w:t xml:space="preserve">   - Cô Hà Thị Kế: Đã nộp Tuần 1-12 (27 tệp); Còn trống 06 thư mục tuần gồm: Tuần 13-16, Tuần 17-20, Tuần 21-24, Tuần 25-28, Tuần 29-32, Tuần 33-35.</w:t>
+        <w:t xml:space="preserve">   - Cô Lê Thị Thu Thủy: Tuần 1 đến 4 thư mục môn Toán 6 không có nộp file (0 tệp); Tuần 5 đến 8 thư mục môn Toán 6 không có nộp file (0 tệp).</w:t>
       </w:r>
     </w:p>
     <w:p>
@@ -1212,7 +1212,7 @@
         <w:rPr>
           <w:sz w:val="23"/>
         </w:rPr>
-        <w:t xml:space="preserve">   - 06 Giáo viên còn lại (Cô Cúc, Cô Hằng, Cô Linh, Cô Thủy, Cô Trang, Thầy Thành): Đã nộp Tuần 1-4 &amp; Tuần 5-8; Còn trống 07 thư mục tuần gồm: Tuần 9-12, Tuần 13-16, Tuần 17-20, Tuần 21-24, Tuần 25-28, Tuần 29-32, Tuần 33-35.</w:t>
+        <w:t xml:space="preserve">   - Cô Hà Thị Kế: Đã nộp Tuần 1-4 và 5-8 đủ các môn; Riêng Tuần 9 đến 12 thư mục HĐTN 8 không có nộp file (0 tệp), thư mục KHTN 6 không có nộp file (0 tệp).</w:t>
       </w:r>
     </w:p>
     <w:p>
@@ -1224,7 +1224,7 @@
         <w:rPr>
           <w:sz w:val="23"/>
         </w:rPr>
-        <w:t xml:space="preserve">   - Rà soát môn học trống file: Thư mục môn Toán 6 của Cô Lê Thị Thu Thủy và môn Toán 8 của Cô Phạm Thị Mỹ Linh hiện tại còn trống tệp tin (0 tệp).</w:t>
+        <w:t xml:space="preserve">   - Thầy Lê Văn Thắng: Tuần 1 đến 4 thư mục Hóa 9, KHTN 7, Toán 9 không có nộp file (0 tệp); Tuần 5 đến 8 thư mục Hóa 9, KHTN 7, Toán 9 không có nộp file (0 tệp).</w:t>
       </w:r>
     </w:p>
     <w:p>
@@ -1236,7 +1236,19 @@
         <w:rPr>
           <w:sz w:val="23"/>
         </w:rPr>
-        <w:t>4. Kiến nghị: Kính đề nghị Tổ trưởng chuyên môn nhắc nhở giáo viên chưa nộp (thầy Lê Văn Thắng) và các giáo viên còn thiếu thư mục tuần/môn phụ trách khẩn trương nộp bổ sung lên Google Drive phục vụ công tác kiểm tra, duyệt giáo án định kỳ.</w:t>
+        <w:t xml:space="preserve">   - 04 Giáo viên còn lại (Cô Cúc, Cô Hằng, Thầy Thành, Cô Trang): Đã nộp đầy đủ các thư mục môn phụ trách trong Tuần 1-4 và Tuần 5-8 (không có thư mục môn nào trống file).</w:t>
+      </w:r>
+    </w:p>
+    <w:p>
+      <w:pPr>
+        <w:spacing w:after="40"/>
+        <w:ind w:left="288"/>
+      </w:pPr>
+      <w:r>
+        <w:rPr>
+          <w:sz w:val="23"/>
+        </w:rPr>
+        <w:t>4. Kiến nghị: Kính đề nghị Tổ trưởng chuyên môn nhắc nhở giáo viên chưa nộp (thầy Lê Văn Thắng) và các giáo viên có thư mục môn chưa có nộp file khẩn trương cập nhật đầy đủ lên Google Drive phục vụ công tác kiểm tra, duyệt giáo án định kỳ.</w:t>
       </w:r>
     </w:p>
     <w:p>

</xml_diff>